<commit_message>
Updated text font for wireframes to give leeway for titles vrs regular text
</commit_message>
<xml_diff>
--- a/01_Standards/Milestone_2_First_Dozen_Views/Deliverable_Example.docx
+++ b/01_Standards/Milestone_2_First_Dozen_Views/Deliverable_Example.docx
@@ -142,6 +142,60 @@
           <w:lang w:eastAsia="en-US"/>
         </w:rPr>
       </w:pPr>
+      <w:r>
+        <w:rPr>
+          <w:noProof/>
+        </w:rPr>
+        <w:drawing>
+          <wp:anchor distT="0" distB="0" distL="114300" distR="114300" simplePos="0" relativeHeight="251663360" behindDoc="0" locked="0" layoutInCell="1" allowOverlap="1" wp14:anchorId="28171F53" wp14:editId="05667742">
+            <wp:simplePos x="0" y="0"/>
+            <wp:positionH relativeFrom="column">
+              <wp:posOffset>2552700</wp:posOffset>
+            </wp:positionH>
+            <wp:positionV relativeFrom="paragraph">
+              <wp:posOffset>1952625</wp:posOffset>
+            </wp:positionV>
+            <wp:extent cx="2095500" cy="209550"/>
+            <wp:effectExtent l="0" t="0" r="0" b="0"/>
+            <wp:wrapNone/>
+            <wp:docPr id="691379483" name="Picture 1"/>
+            <wp:cNvGraphicFramePr>
+              <a:graphicFrameLocks xmlns:a="http://schemas.openxmlformats.org/drawingml/2006/main" noChangeAspect="1"/>
+            </wp:cNvGraphicFramePr>
+            <a:graphic xmlns:a="http://schemas.openxmlformats.org/drawingml/2006/main">
+              <a:graphicData uri="http://schemas.openxmlformats.org/drawingml/2006/picture">
+                <pic:pic xmlns:pic="http://schemas.openxmlformats.org/drawingml/2006/picture">
+                  <pic:nvPicPr>
+                    <pic:cNvPr id="691379483" name=""/>
+                    <pic:cNvPicPr/>
+                  </pic:nvPicPr>
+                  <pic:blipFill>
+                    <a:blip r:embed="rId5">
+                      <a:extLst>
+                        <a:ext uri="{28A0092B-C50C-407E-A947-70E740481C1C}">
+                          <a14:useLocalDpi xmlns:a14="http://schemas.microsoft.com/office/drawing/2010/main" val="0"/>
+                        </a:ext>
+                      </a:extLst>
+                    </a:blip>
+                    <a:stretch>
+                      <a:fillRect/>
+                    </a:stretch>
+                  </pic:blipFill>
+                  <pic:spPr>
+                    <a:xfrm>
+                      <a:off x="0" y="0"/>
+                      <a:ext cx="2095500" cy="209550"/>
+                    </a:xfrm>
+                    <a:prstGeom prst="rect">
+                      <a:avLst/>
+                    </a:prstGeom>
+                  </pic:spPr>
+                </pic:pic>
+              </a:graphicData>
+            </a:graphic>
+          </wp:anchor>
+        </w:drawing>
+      </w:r>
       <w:r>
         <w:rPr>
           <w:noProof/>
@@ -170,7 +224,7 @@
                     <pic:cNvPicPr/>
                   </pic:nvPicPr>
                   <pic:blipFill>
-                    <a:blip r:embed="rId5">
+                    <a:blip r:embed="rId6">
                       <a:extLst>
                         <a:ext uri="{28A0092B-C50C-407E-A947-70E740481C1C}">
                           <a14:useLocalDpi xmlns:a14="http://schemas.microsoft.com/office/drawing/2010/main" val="0"/>
@@ -224,7 +278,7 @@
                     <pic:cNvPicPr/>
                   </pic:nvPicPr>
                   <pic:blipFill>
-                    <a:blip r:embed="rId6">
+                    <a:blip r:embed="rId7">
                       <a:extLst>
                         <a:ext uri="{28A0092B-C50C-407E-A947-70E740481C1C}">
                           <a14:useLocalDpi xmlns:a14="http://schemas.microsoft.com/office/drawing/2010/main" val="0"/>
@@ -255,61 +309,7 @@
           <w:noProof/>
         </w:rPr>
         <w:drawing>
-          <wp:anchor distT="0" distB="0" distL="114300" distR="114300" simplePos="0" relativeHeight="251658240" behindDoc="0" locked="0" layoutInCell="1" allowOverlap="1" wp14:anchorId="17D22E12" wp14:editId="343D8A6C">
-            <wp:simplePos x="0" y="0"/>
-            <wp:positionH relativeFrom="column">
-              <wp:posOffset>2581275</wp:posOffset>
-            </wp:positionH>
-            <wp:positionV relativeFrom="paragraph">
-              <wp:posOffset>1866900</wp:posOffset>
-            </wp:positionV>
-            <wp:extent cx="1943100" cy="295275"/>
-            <wp:effectExtent l="0" t="0" r="0" b="9525"/>
-            <wp:wrapNone/>
-            <wp:docPr id="1205797995" name="Picture 1"/>
-            <wp:cNvGraphicFramePr>
-              <a:graphicFrameLocks xmlns:a="http://schemas.openxmlformats.org/drawingml/2006/main" noChangeAspect="1"/>
-            </wp:cNvGraphicFramePr>
-            <a:graphic xmlns:a="http://schemas.openxmlformats.org/drawingml/2006/main">
-              <a:graphicData uri="http://schemas.openxmlformats.org/drawingml/2006/picture">
-                <pic:pic xmlns:pic="http://schemas.openxmlformats.org/drawingml/2006/picture">
-                  <pic:nvPicPr>
-                    <pic:cNvPr id="1205797995" name=""/>
-                    <pic:cNvPicPr/>
-                  </pic:nvPicPr>
-                  <pic:blipFill>
-                    <a:blip r:embed="rId7">
-                      <a:extLst>
-                        <a:ext uri="{28A0092B-C50C-407E-A947-70E740481C1C}">
-                          <a14:useLocalDpi xmlns:a14="http://schemas.microsoft.com/office/drawing/2010/main" val="0"/>
-                        </a:ext>
-                      </a:extLst>
-                    </a:blip>
-                    <a:stretch>
-                      <a:fillRect/>
-                    </a:stretch>
-                  </pic:blipFill>
-                  <pic:spPr>
-                    <a:xfrm>
-                      <a:off x="0" y="0"/>
-                      <a:ext cx="1943100" cy="295275"/>
-                    </a:xfrm>
-                    <a:prstGeom prst="rect">
-                      <a:avLst/>
-                    </a:prstGeom>
-                  </pic:spPr>
-                </pic:pic>
-              </a:graphicData>
-            </a:graphic>
-          </wp:anchor>
-        </w:drawing>
-      </w:r>
-      <w:r>
-        <w:rPr>
-          <w:noProof/>
-        </w:rPr>
-        <w:drawing>
-          <wp:inline distT="0" distB="0" distL="0" distR="0" wp14:anchorId="3F3BF4D7" wp14:editId="5924FB7D">
+          <wp:inline distT="0" distB="0" distL="0" distR="0" wp14:anchorId="3F3BF4D7" wp14:editId="7B6E4D1F">
             <wp:extent cx="5943600" cy="3385820"/>
             <wp:effectExtent l="0" t="0" r="0" b="5080"/>
             <wp:docPr id="25146496" name="Picture 1"/>
@@ -428,7 +428,7 @@
           <w:noProof/>
         </w:rPr>
         <w:drawing>
-          <wp:anchor distT="0" distB="0" distL="114300" distR="114300" simplePos="0" relativeHeight="251661312" behindDoc="0" locked="0" layoutInCell="1" allowOverlap="1" wp14:anchorId="6F76F6A7" wp14:editId="1DBD8C76">
+          <wp:anchor distT="0" distB="0" distL="114300" distR="114300" simplePos="0" relativeHeight="251661312" behindDoc="0" locked="0" layoutInCell="1" allowOverlap="1" wp14:anchorId="6F76F6A7" wp14:editId="79001758">
             <wp:simplePos x="0" y="0"/>
             <wp:positionH relativeFrom="column">
               <wp:posOffset>3867150</wp:posOffset>
@@ -451,7 +451,7 @@
                     <pic:cNvPicPr/>
                   </pic:nvPicPr>
                   <pic:blipFill>
-                    <a:blip r:embed="rId5">
+                    <a:blip r:embed="rId6">
                       <a:extLst>
                         <a:ext uri="{28A0092B-C50C-407E-A947-70E740481C1C}">
                           <a14:useLocalDpi xmlns:a14="http://schemas.microsoft.com/office/drawing/2010/main" val="0"/>
@@ -505,7 +505,7 @@
                     <pic:cNvPicPr/>
                   </pic:nvPicPr>
                   <pic:blipFill>
-                    <a:blip r:embed="rId6">
+                    <a:blip r:embed="rId7">
                       <a:extLst>
                         <a:ext uri="{28A0092B-C50C-407E-A947-70E740481C1C}">
                           <a14:useLocalDpi xmlns:a14="http://schemas.microsoft.com/office/drawing/2010/main" val="0"/>
@@ -659,7 +659,31 @@
           <w:szCs w:val="20"/>
           <w:lang w:eastAsia="en-US"/>
         </w:rPr>
-        <w:t>ial 10 pt</w:t>
+        <w:t>ial 10</w:t>
+      </w:r>
+      <w:r>
+        <w:rPr>
+          <w:rFonts w:ascii="Arial" w:eastAsia="Times New Roman" w:hAnsi="Arial" w:cs="Arial"/>
+          <w:i/>
+          <w:iCs/>
+          <w:position w:val="200"/>
+          <w:sz w:val="20"/>
+          <w:szCs w:val="20"/>
+          <w:lang w:eastAsia="en-US"/>
+        </w:rPr>
+        <w:t xml:space="preserve">-14 </w:t>
+      </w:r>
+      <w:r>
+        <w:rPr>
+          <w:rFonts w:ascii="Arial" w:eastAsia="Times New Roman" w:hAnsi="Arial" w:cs="Arial"/>
+          <w:i/>
+          <w:iCs/>
+          <w:position w:val="200"/>
+          <w:sz w:val="20"/>
+          <w:szCs w:val="20"/>
+          <w:lang w:eastAsia="en-US"/>
+        </w:rPr>
+        <w:t>pt</w:t>
       </w:r>
       <w:r>
         <w:rPr>
@@ -906,13 +930,23 @@
                 <w:lang w:eastAsia="en-US"/>
               </w:rPr>
             </w:pPr>
+            <w:proofErr w:type="gramStart"/>
             <w:r>
               <w:rPr>
                 <w:rFonts w:ascii="Arial" w:eastAsia="Times New Roman" w:hAnsi="Arial" w:cs="Arial"/>
                 <w:sz w:val="22"/>
                 <w:lang w:eastAsia="en-US"/>
               </w:rPr>
-              <w:t>Allows students to search for jobs and companies.</w:t>
+              <w:t>Allows</w:t>
+            </w:r>
+            <w:proofErr w:type="gramEnd"/>
+            <w:r>
+              <w:rPr>
+                <w:rFonts w:ascii="Arial" w:eastAsia="Times New Roman" w:hAnsi="Arial" w:cs="Arial"/>
+                <w:sz w:val="22"/>
+                <w:lang w:eastAsia="en-US"/>
+              </w:rPr>
+              <w:t xml:space="preserve"> students to search for jobs and companies.</w:t>
             </w:r>
           </w:p>
         </w:tc>
@@ -1599,7 +1633,23 @@
           <w:rFonts w:ascii="Times New Roman" w:eastAsia="Times New Roman" w:hAnsi="Times New Roman" w:cs="Times New Roman"/>
           <w:lang w:eastAsia="en-US"/>
         </w:rPr>
-        <w:t xml:space="preserve">Tables shall span the full document text width using </w:t>
+        <w:t xml:space="preserve">Tables shall span the full document </w:t>
+      </w:r>
+      <w:proofErr w:type="gramStart"/>
+      <w:r>
+        <w:rPr>
+          <w:rFonts w:ascii="Times New Roman" w:eastAsia="Times New Roman" w:hAnsi="Times New Roman" w:cs="Times New Roman"/>
+          <w:lang w:eastAsia="en-US"/>
+        </w:rPr>
+        <w:t>text width</w:t>
+      </w:r>
+      <w:proofErr w:type="gramEnd"/>
+      <w:r>
+        <w:rPr>
+          <w:rFonts w:ascii="Times New Roman" w:eastAsia="Times New Roman" w:hAnsi="Times New Roman" w:cs="Times New Roman"/>
+          <w:lang w:eastAsia="en-US"/>
+        </w:rPr>
+        <w:t xml:space="preserve"> using </w:t>
       </w:r>
       <w:r>
         <w:rPr>
@@ -1738,7 +1788,23 @@
           <w:rFonts w:ascii="Times New Roman" w:eastAsia="Times New Roman" w:hAnsi="Times New Roman" w:cs="Times New Roman"/>
           <w:lang w:eastAsia="en-US"/>
         </w:rPr>
-        <w:t>First-column field labels shall use Arial Bold 1</w:t>
+        <w:t xml:space="preserve">First-column field </w:t>
+      </w:r>
+      <w:proofErr w:type="gramStart"/>
+      <w:r>
+        <w:rPr>
+          <w:rFonts w:ascii="Times New Roman" w:eastAsia="Times New Roman" w:hAnsi="Times New Roman" w:cs="Times New Roman"/>
+          <w:lang w:eastAsia="en-US"/>
+        </w:rPr>
+        <w:t>labels shall</w:t>
+      </w:r>
+      <w:proofErr w:type="gramEnd"/>
+      <w:r>
+        <w:rPr>
+          <w:rFonts w:ascii="Times New Roman" w:eastAsia="Times New Roman" w:hAnsi="Times New Roman" w:cs="Times New Roman"/>
+          <w:lang w:eastAsia="en-US"/>
+        </w:rPr>
+        <w:t xml:space="preserve"> use Arial Bold 1</w:t>
       </w:r>
       <w:r>
         <w:rPr>
@@ -1791,14 +1857,25 @@
     </w:p>
     <w:p>
       <w:pPr>
-        <w:rPr>
-          <w:rFonts w:ascii="Arial" w:hAnsi="Arial" w:cs="Arial"/>
-          <w:i/>
-          <w:iCs/>
-          <w:sz w:val="20"/>
-          <w:szCs w:val="20"/>
-        </w:rPr>
+        <w:pStyle w:val="Alt1-Hd-1"/>
+        <w:jc w:val="left"/>
       </w:pPr>
+      <w:r>
+        <w:t>Wireframes</w:t>
+      </w:r>
+    </w:p>
+    <w:p>
+      <w:pPr>
+        <w:rPr>
+          <w:lang w:eastAsia="en-US"/>
+        </w:rPr>
+      </w:pPr>
+      <w:r>
+        <w:rPr>
+          <w:lang w:eastAsia="en-US"/>
+        </w:rPr>
+        <w:t>You will need to keep a copy of an editable version of your wireframe in case changes need to be made. You are welcome to turn in your wireframes individually to be approved by the Chief of Q/A before turning in the Word doc as the final deliverable to be approved by the Chief of Q/A.</w:t>
+      </w:r>
     </w:p>
     <w:p>
       <w:pPr>
@@ -1806,7 +1883,7 @@
         <w:jc w:val="left"/>
       </w:pPr>
       <w:r>
-        <w:t>Wireframes</w:t>
+        <w:t>Final Deliverable</w:t>
       </w:r>
     </w:p>
     <w:p>
@@ -1819,41 +1896,78 @@
         <w:rPr>
           <w:lang w:eastAsia="en-US"/>
         </w:rPr>
-        <w:t xml:space="preserve">You will need to keep a copy of an editable version of your wireframe in case changes need to be made. You are welcome to turn in your wireframes individually </w:t>
-      </w:r>
-      <w:r>
-        <w:rPr>
-          <w:lang w:eastAsia="en-US"/>
-        </w:rPr>
-        <w:t>to be approved by the Chief of Q/A</w:t>
-      </w:r>
-      <w:r>
-        <w:rPr>
-          <w:lang w:eastAsia="en-US"/>
-        </w:rPr>
-        <w:t xml:space="preserve"> before turning in the Word doc as the final deliverable to be approved by the Chief of Q/A.</w:t>
+        <w:t>The final deliverable is the Word document following the pattern shown in this document for each UI view assigned. So, since each team has been assigned 2 UI views, that means that each team will turn in 2 Word documents.</w:t>
       </w:r>
     </w:p>
     <w:p>
       <w:pPr>
-        <w:pStyle w:val="Alt1-Hd-1"/>
-        <w:jc w:val="left"/>
+        <w:rPr>
+          <w:lang w:eastAsia="en-US"/>
+        </w:rPr>
       </w:pPr>
-      <w:r>
-        <w:t>Final Deliverable</w:t>
-      </w:r>
     </w:p>
     <w:p>
       <w:pPr>
         <w:rPr>
+          <w:sz w:val="20"/>
+          <w:szCs w:val="20"/>
           <w:lang w:eastAsia="en-US"/>
         </w:rPr>
       </w:pPr>
       <w:r>
         <w:rPr>
-          <w:lang w:eastAsia="en-US"/>
-        </w:rPr>
-        <w:t>The final deliverable is the Word document following the pattern shown in this document for each UI view assigned. So, since each team has been assigned 2 UI views, that means that each team will turn in 2 Word documents.</w:t>
+          <w:rFonts w:ascii="Arial" w:eastAsia="Times New Roman" w:hAnsi="Arial" w:cs="Arial"/>
+          <w:i/>
+          <w:iCs/>
+          <w:sz w:val="20"/>
+          <w:szCs w:val="20"/>
+          <w:lang w:eastAsia="en-US"/>
+        </w:rPr>
+        <w:t>(</w:t>
+      </w:r>
+      <w:r>
+        <w:rPr>
+          <w:rFonts w:ascii="Arial" w:eastAsia="Times New Roman" w:hAnsi="Arial" w:cs="Arial"/>
+          <w:i/>
+          <w:iCs/>
+          <w:sz w:val="20"/>
+          <w:szCs w:val="20"/>
+          <w:lang w:eastAsia="en-US"/>
+        </w:rPr>
+        <w:t>Text in Wireframes</w:t>
+      </w:r>
+      <w:r>
+        <w:rPr>
+          <w:rFonts w:ascii="Arial" w:eastAsia="Times New Roman" w:hAnsi="Arial" w:cs="Arial"/>
+          <w:i/>
+          <w:iCs/>
+          <w:sz w:val="20"/>
+          <w:szCs w:val="20"/>
+          <w:lang w:eastAsia="en-US"/>
+        </w:rPr>
+        <w:t xml:space="preserve"> - Aria 1</w:t>
+      </w:r>
+      <w:r>
+        <w:rPr>
+          <w:rFonts w:ascii="Arial" w:eastAsia="Times New Roman" w:hAnsi="Arial" w:cs="Arial"/>
+          <w:i/>
+          <w:iCs/>
+          <w:sz w:val="20"/>
+          <w:szCs w:val="20"/>
+          <w:lang w:eastAsia="en-US"/>
+        </w:rPr>
+        <w:t>0-14</w:t>
+      </w:r>
+      <w:r>
+        <w:rPr>
+          <w:rFonts w:ascii="Arial" w:eastAsia="Times New Roman" w:hAnsi="Arial" w:cs="Arial"/>
+          <w:i/>
+          <w:iCs/>
+          <w:sz w:val="20"/>
+          <w:szCs w:val="20"/>
+          <w:lang w:eastAsia="en-US"/>
+        </w:rPr>
+        <w:t xml:space="preserve"> pt)</w:t>
       </w:r>
     </w:p>
     <w:sectPr>

</xml_diff>